<commit_message>
Report: embed system diagram (Figure 1), correct dark-patterns count to 857, state TPE trial count
</commit_message>
<xml_diff>
--- a/docs/AdInsight_Final_Report.docx
+++ b/docs/AdInsight_Final_Report.docx
@@ -654,6 +654,57 @@
           <w:szCs w:val="21"/>
         </w:rPr>
         <w:t xml:space="preserve"> classifier and phrase-matching system, and returns a plain-language explanation along with outside context from the review-insight layer.</w:t>
+      </w:r>
+    </w:p>
+    <w:p>
+      <w:pPr>
+        <w:jc w:val="center"/>
+      </w:pPr>
+      <w:r>
+        <w:drawing>
+          <wp:inline xmlns:a="http://schemas.openxmlformats.org/drawingml/2006/main" xmlns:pic="http://schemas.openxmlformats.org/drawingml/2006/picture">
+            <wp:extent cx="4754880" cy="4779906"/>
+            <wp:docPr id="1" name="Picture 1"/>
+            <wp:cNvGraphicFramePr>
+              <a:graphicFrameLocks noChangeAspect="1"/>
+            </wp:cNvGraphicFramePr>
+            <a:graphic>
+              <a:graphicData uri="http://schemas.openxmlformats.org/drawingml/2006/picture">
+                <pic:pic>
+                  <pic:nvPicPr>
+                    <pic:cNvPr id="0" name="workflow_ad_explainer.png"/>
+                    <pic:cNvPicPr/>
+                  </pic:nvPicPr>
+                  <pic:blipFill>
+                    <a:blip r:embed="rId11"/>
+                    <a:stretch>
+                      <a:fillRect/>
+                    </a:stretch>
+                  </pic:blipFill>
+                  <pic:spPr>
+                    <a:xfrm>
+                      <a:off x="0" y="0"/>
+                      <a:ext cx="4754880" cy="4779906"/>
+                    </a:xfrm>
+                    <a:prstGeom prst="rect"/>
+                  </pic:spPr>
+                </pic:pic>
+              </a:graphicData>
+            </a:graphic>
+          </wp:inline>
+        </w:drawing>
+      </w:r>
+    </w:p>
+    <w:p>
+      <w:pPr>
+        <w:jc w:val="center"/>
+      </w:pPr>
+      <w:r>
+        <w:rPr>
+          <w:i/>
+          <w:sz w:val="18"/>
+        </w:rPr>
+        <w:t>Figure 1: AdInsight end-to-end system — ad input (app or browser extension), text extraction, analysis and review insight, and plain-language explanation.</w:t>
       </w:r>
     </w:p>
     <w:p>
@@ -1250,7 +1301,7 @@
           <w:sz w:val="21"/>
           <w:szCs w:val="22"/>
         </w:rPr>
-        <w:t>The project originally used a smaller seven-class dataset. Analysis of that dataset revealed that some classes contained highly repetitive phrases, which created a risk that the model could learn shortcuts rather than broader persuasive patterns. For example, “limited stock” appeared in 435 of 449 Scarcity examples. To increase the variety of language in the training data, we incorporated approximately 940 examples from the Mathur et al. dark-patterns corpus, which contains real-world e-commerce language collected from shopping websites. Compatible examples were mapped to our existing Scarcity, Urgency, and Social Proof categories.</w:t>
+        <w:t>The project originally used a smaller seven-class dataset. Analysis of that dataset revealed that some classes contained highly repetitive phrases, which created a risk that the model could learn shortcuts rather than broader persuasive patterns. For example, “limited stock” appeared in 435 of 449 Scarcity examples. To increase the variety of language in the training data, we incorporated 857 examples from the Mathur et al. dark-patterns corpus, which contains real-world e-commerce language collected from shopping websites. Compatible examples were mapped to our existing Scarcity, Urgency, and Social Proof categories.</w:t>
       </w:r>
     </w:p>
     <w:p>
@@ -1579,7 +1630,7 @@
           <w:sz w:val="21"/>
           <w:szCs w:val="22"/>
         </w:rPr>
-        <w:t xml:space="preserve"> Estimator (TPE) search to tune the training configuration. The search included learning rates of 1e-5, 2e-5, 3e-5, and 5e-5; batch sizes of 8 and 16; two, three, or four epochs; and weight-decay values of 0, 0.01, and 0.05.</w:t>
+        <w:t xml:space="preserve"> Estimator (TPE) search to tune the training configuration. The search included learning rates of 1e-5, 2e-5, 3e-5, and 5e-5; batch sizes of 8 and 16; two, three, or four epochs; and weight-decay values of 0, 0.01, and 0.05. TPE sampled three trial configurations from this space, selected on validation macro F1.</w:t>
       </w:r>
     </w:p>
     <w:p>

</xml_diff>

<commit_message>
Update final report with VLM and baseline results
</commit_message>
<xml_diff>
--- a/docs/AdInsight_Final_Report.docx
+++ b/docs/AdInsight_Final_Report.docx
@@ -345,35 +345,35 @@
         <w:keepNext w:val="0"/>
         <w:keepLines w:val="0"/>
         <w:rPr>
-          <w:rFonts w:ascii="Times New Roman" w:eastAsiaTheme="minorEastAsia" w:hAnsi="Times New Roman" w:cs="Times New Roman"/>
+          <w:rFonts w:ascii="Times New Roman" w:hAnsi="Times New Roman" w:cs="Times New Roman"/>
           <w:b w:val="0"/>
           <w:bCs w:val="0"/>
           <w:color w:val="auto"/>
           <w:sz w:val="21"/>
-          <w:szCs w:val="22"/>
+          <w:szCs w:val="21"/>
         </w:rPr>
       </w:pPr>
       <w:proofErr w:type="spellStart"/>
       <w:r>
         <w:rPr>
-          <w:rFonts w:ascii="Times New Roman" w:eastAsiaTheme="minorEastAsia" w:hAnsi="Times New Roman" w:cs="Times New Roman"/>
+          <w:rFonts w:ascii="Times New Roman" w:hAnsi="Times New Roman" w:cs="Times New Roman"/>
           <w:b w:val="0"/>
           <w:bCs w:val="0"/>
           <w:color w:val="auto"/>
           <w:sz w:val="21"/>
-          <w:szCs w:val="22"/>
+          <w:szCs w:val="21"/>
         </w:rPr>
         <w:t>AdInsight</w:t>
       </w:r>
       <w:proofErr w:type="spellEnd"/>
       <w:r>
         <w:rPr>
-          <w:rFonts w:ascii="Times New Roman" w:eastAsiaTheme="minorEastAsia" w:hAnsi="Times New Roman" w:cs="Times New Roman"/>
+          <w:rFonts w:ascii="Times New Roman" w:hAnsi="Times New Roman" w:cs="Times New Roman"/>
           <w:b w:val="0"/>
           <w:bCs w:val="0"/>
           <w:color w:val="auto"/>
           <w:sz w:val="21"/>
-          <w:szCs w:val="22"/>
+          <w:szCs w:val="21"/>
         </w:rPr>
         <w:t xml:space="preserve"> is an end-to-end advertising analysis system that accepts an advertisement and returns a plain-language explanation of the persuasive tactics it detects. The final system supports both text and image-based advertisements and can be accessed through a desktop/web application or a Chrome browser extension.</w:t>
       </w:r>
@@ -384,78 +384,93 @@
         <w:keepNext w:val="0"/>
         <w:keepLines w:val="0"/>
         <w:rPr>
-          <w:rFonts w:ascii="Times New Roman" w:eastAsiaTheme="minorEastAsia" w:hAnsi="Times New Roman" w:cs="Times New Roman"/>
+          <w:rFonts w:ascii="Times New Roman" w:hAnsi="Times New Roman" w:cs="Times New Roman"/>
           <w:b w:val="0"/>
           <w:bCs w:val="0"/>
           <w:color w:val="auto"/>
           <w:sz w:val="21"/>
-          <w:szCs w:val="22"/>
+          <w:szCs w:val="21"/>
         </w:rPr>
       </w:pPr>
       <w:r>
         <w:rPr>
-          <w:rFonts w:ascii="Times New Roman" w:eastAsiaTheme="minorEastAsia" w:hAnsi="Times New Roman" w:cs="Times New Roman"/>
+          <w:rFonts w:ascii="Times New Roman" w:hAnsi="Times New Roman" w:cs="Times New Roman"/>
           <w:b w:val="0"/>
           <w:bCs w:val="0"/>
           <w:color w:val="auto"/>
           <w:sz w:val="21"/>
-          <w:szCs w:val="22"/>
+          <w:szCs w:val="21"/>
         </w:rPr>
         <w:t>The process begins when a user encounters an advertisement they want to analyze. In the application, the user can paste advertisement text directly or upload a screenshot. The browser extension allows the user to analyze an advertisement while viewing the webpage where they encountered it. Both interfaces connect to the same backend, giving users multiple ways to access the same underlying analysis.</w:t>
       </w:r>
     </w:p>
     <w:p>
       <w:pPr>
-        <w:pStyle w:val="NormalWeb"/>
-        <w:rPr>
+        <w:pStyle w:val="Heading1"/>
+        <w:keepNext w:val="0"/>
+        <w:keepLines w:val="0"/>
+        <w:rPr>
+          <w:rFonts w:ascii="Times New Roman" w:hAnsi="Times New Roman" w:cs="Times New Roman"/>
+          <w:b w:val="0"/>
+          <w:bCs w:val="0"/>
+          <w:color w:val="auto"/>
           <w:sz w:val="21"/>
           <w:szCs w:val="21"/>
         </w:rPr>
       </w:pPr>
       <w:r>
         <w:rPr>
-          <w:rFonts w:eastAsiaTheme="minorEastAsia"/>
+          <w:rFonts w:ascii="Times New Roman" w:hAnsi="Times New Roman" w:cs="Times New Roman"/>
+          <w:b w:val="0"/>
+          <w:bCs w:val="0"/>
+          <w:color w:val="auto"/>
           <w:sz w:val="21"/>
-          <w:szCs w:val="22"/>
+          <w:szCs w:val="21"/>
         </w:rPr>
         <w:t xml:space="preserve">For text input, the advertisement can be passed directly into the NLP pipeline. Image advertisements require an additional extraction step to convert the text in the screenshot into a form the classifier can process. The project initially relied on </w:t>
       </w:r>
       <w:proofErr w:type="spellStart"/>
       <w:r>
         <w:rPr>
-          <w:rFonts w:eastAsiaTheme="minorEastAsia"/>
+          <w:rFonts w:ascii="Times New Roman" w:hAnsi="Times New Roman" w:cs="Times New Roman"/>
+          <w:b w:val="0"/>
+          <w:bCs w:val="0"/>
+          <w:color w:val="auto"/>
           <w:sz w:val="21"/>
-          <w:szCs w:val="22"/>
+          <w:szCs w:val="21"/>
         </w:rPr>
         <w:t>RapidOCR</w:t>
       </w:r>
       <w:proofErr w:type="spellEnd"/>
       <w:r>
         <w:rPr>
-          <w:rFonts w:eastAsiaTheme="minorEastAsia"/>
+          <w:rFonts w:ascii="Times New Roman" w:hAnsi="Times New Roman" w:cs="Times New Roman"/>
+          <w:b w:val="0"/>
+          <w:bCs w:val="0"/>
+          <w:color w:val="auto"/>
           <w:sz w:val="21"/>
-          <w:szCs w:val="22"/>
-        </w:rPr>
-        <w:t xml:space="preserve"> for this step, but later testing showed that complex advertisements could cause OCR to lose or </w:t>
+          <w:szCs w:val="21"/>
+        </w:rPr>
+        <w:t xml:space="preserve"> for this step, but later testing showed that complex advertisements could cause OCR to lose or incorrectly combine important words. </w:t>
       </w:r>
       <w:r>
         <w:rPr>
-          <w:rFonts w:eastAsiaTheme="minorEastAsia"/>
+          <w:rFonts w:ascii="Times New Roman" w:hAnsi="Times New Roman" w:cs="Times New Roman"/>
+          <w:b w:val="0"/>
+          <w:bCs w:val="0"/>
+          <w:color w:val="auto"/>
           <w:sz w:val="21"/>
           <w:szCs w:val="21"/>
         </w:rPr>
-        <w:t xml:space="preserve">incorrectly combine important words. </w:t>
-      </w:r>
-      <w:r>
-        <w:rPr>
-          <w:sz w:val="21"/>
-          <w:szCs w:val="21"/>
-        </w:rPr>
-        <w:t xml:space="preserve">The final system uses a vision-language model (VLM) as the primary transcription method when available, with </w:t>
+        <w:t xml:space="preserve">The final system uses a vision-language model (VLM) as the primary text-extraction method when available, with </w:t>
       </w:r>
       <w:proofErr w:type="spellStart"/>
       <w:r>
         <w:rPr>
+          <w:rFonts w:ascii="Times New Roman" w:hAnsi="Times New Roman" w:cs="Times New Roman"/>
+          <w:b w:val="0"/>
+          <w:bCs w:val="0"/>
+          <w:color w:val="auto"/>
           <w:sz w:val="21"/>
           <w:szCs w:val="21"/>
         </w:rPr>
@@ -464,6 +479,10 @@
       <w:proofErr w:type="spellEnd"/>
       <w:r>
         <w:rPr>
+          <w:rFonts w:ascii="Times New Roman" w:hAnsi="Times New Roman" w:cs="Times New Roman"/>
+          <w:b w:val="0"/>
+          <w:bCs w:val="0"/>
+          <w:color w:val="auto"/>
           <w:sz w:val="21"/>
           <w:szCs w:val="21"/>
         </w:rPr>
@@ -471,6 +490,10 @@
       </w:r>
       <w:r>
         <w:rPr>
+          <w:rFonts w:ascii="Times New Roman" w:hAnsi="Times New Roman" w:cs="Times New Roman"/>
+          <w:b w:val="0"/>
+          <w:bCs w:val="0"/>
+          <w:color w:val="auto"/>
           <w:sz w:val="21"/>
           <w:szCs w:val="21"/>
         </w:rPr>
@@ -478,16 +501,33 @@
       </w:r>
       <w:r>
         <w:rPr>
-          <w:rFonts w:eastAsiaTheme="minorEastAsia"/>
+          <w:rFonts w:ascii="Times New Roman" w:hAnsi="Times New Roman" w:cs="Times New Roman"/>
+          <w:b w:val="0"/>
+          <w:bCs w:val="0"/>
+          <w:color w:val="auto"/>
           <w:sz w:val="21"/>
           <w:szCs w:val="21"/>
         </w:rPr>
-        <w:t xml:space="preserve">The VLM is intentionally restricted to transcription: it extracts what the advertisement says but does not determine which persuasive tactic is being used. That classification remains the responsibility of the fine-tuned </w:t>
+        <w:t xml:space="preserve">The </w:t>
+      </w:r>
+      <w:r>
+        <w:rPr>
+          <w:rFonts w:ascii="Times New Roman" w:hAnsi="Times New Roman" w:cs="Times New Roman"/>
+          <w:b w:val="0"/>
+          <w:bCs w:val="0"/>
+          <w:color w:val="auto"/>
+          <w:sz w:val="21"/>
+          <w:szCs w:val="21"/>
+        </w:rPr>
+        <w:t xml:space="preserve">VLM is intentionally restricted to transcription: it extracts what the advertisement says but does not determine which persuasive tactic is being used. That classification remains the responsibility of the fine-tuned </w:t>
       </w:r>
       <w:proofErr w:type="spellStart"/>
       <w:r>
         <w:rPr>
-          <w:rFonts w:eastAsiaTheme="minorEastAsia"/>
+          <w:rFonts w:ascii="Times New Roman" w:hAnsi="Times New Roman" w:cs="Times New Roman"/>
+          <w:b w:val="0"/>
+          <w:bCs w:val="0"/>
+          <w:color w:val="auto"/>
           <w:sz w:val="21"/>
           <w:szCs w:val="21"/>
         </w:rPr>
@@ -496,7 +536,10 @@
       <w:proofErr w:type="spellEnd"/>
       <w:r>
         <w:rPr>
-          <w:rFonts w:eastAsiaTheme="minorEastAsia"/>
+          <w:rFonts w:ascii="Times New Roman" w:hAnsi="Times New Roman" w:cs="Times New Roman"/>
+          <w:b w:val="0"/>
+          <w:bCs w:val="0"/>
+          <w:color w:val="auto"/>
           <w:sz w:val="21"/>
           <w:szCs w:val="21"/>
         </w:rPr>
@@ -509,36 +552,36 @@
         <w:keepNext w:val="0"/>
         <w:keepLines w:val="0"/>
         <w:rPr>
-          <w:rFonts w:ascii="Times New Roman" w:eastAsiaTheme="minorEastAsia" w:hAnsi="Times New Roman" w:cs="Times New Roman"/>
+          <w:rFonts w:ascii="Times New Roman" w:hAnsi="Times New Roman" w:cs="Times New Roman"/>
           <w:b w:val="0"/>
           <w:bCs w:val="0"/>
           <w:color w:val="auto"/>
           <w:sz w:val="21"/>
-          <w:szCs w:val="22"/>
+          <w:szCs w:val="21"/>
         </w:rPr>
       </w:pPr>
       <w:r>
         <w:rPr>
-          <w:rFonts w:ascii="Times New Roman" w:eastAsiaTheme="minorEastAsia" w:hAnsi="Times New Roman" w:cs="Times New Roman"/>
+          <w:rFonts w:ascii="Times New Roman" w:hAnsi="Times New Roman" w:cs="Times New Roman"/>
           <w:b w:val="0"/>
           <w:bCs w:val="0"/>
           <w:color w:val="auto"/>
           <w:sz w:val="21"/>
-          <w:szCs w:val="22"/>
-        </w:rPr>
-        <w:t xml:space="preserve">After the text is extracted, the classifier predicts a persuasion category. The system also compares the text with trigger phrases defined in our labeling guidelines. These two signals are shown separately in the interface. A classifier-based </w:t>
+          <w:szCs w:val="21"/>
+        </w:rPr>
+        <w:t xml:space="preserve">After the text is extracted, the classifier predicts a persuasion category. The system also compares the text with trigger phrases defined in our labeling guidelines. These two signals are shown separately in the interface. A classifier-based result is identified as the model’s prediction, while a phrase directly matched in the advertisement is identified as a </w:t>
       </w:r>
       <w:r>
         <w:rPr>
-          <w:rFonts w:ascii="Times New Roman" w:eastAsiaTheme="minorEastAsia" w:hAnsi="Times New Roman" w:cs="Times New Roman"/>
+          <w:rFonts w:ascii="Times New Roman" w:hAnsi="Times New Roman" w:cs="Times New Roman"/>
           <w:b w:val="0"/>
           <w:bCs w:val="0"/>
           <w:color w:val="auto"/>
           <w:sz w:val="21"/>
-          <w:szCs w:val="22"/>
+          <w:szCs w:val="21"/>
         </w:rPr>
         <w:lastRenderedPageBreak/>
-        <w:t>result is identified as the model’s prediction, while a phrase directly matched in the advertisement is identified as a phrase match. This distinction is important because the classifier is single label, while a real advertisement may contain more than one persuasive technique.</w:t>
+        <w:t>phrase match. This distinction is important because the classifier is single label, while a real advertisement may contain more than one persuasive technique.</w:t>
       </w:r>
     </w:p>
     <w:p>
@@ -547,94 +590,51 @@
         <w:keepNext w:val="0"/>
         <w:keepLines w:val="0"/>
         <w:rPr>
-          <w:rFonts w:ascii="Times New Roman" w:eastAsiaTheme="minorEastAsia" w:hAnsi="Times New Roman" w:cs="Times New Roman"/>
+          <w:rFonts w:ascii="Times New Roman" w:hAnsi="Times New Roman" w:cs="Times New Roman"/>
+        </w:rPr>
+      </w:pPr>
+      <w:r>
+        <w:rPr>
+          <w:rFonts w:ascii="Times New Roman" w:hAnsi="Times New Roman" w:cs="Times New Roman"/>
           <w:b w:val="0"/>
           <w:bCs w:val="0"/>
           <w:color w:val="auto"/>
           <w:sz w:val="21"/>
-          <w:szCs w:val="22"/>
-        </w:rPr>
-      </w:pPr>
+          <w:szCs w:val="21"/>
+        </w:rPr>
+        <w:t>The final interface turns these results into a short explanation instead of showing the user only probabilities or model labels. For image advertisements, the application also displays the text that was extracted before classification. This gives users a way to verify what the system analyzed and helps make possible OCR or transcription errors more transparent.</w:t>
+      </w:r>
       <w:r>
         <w:rPr>
-          <w:rFonts w:ascii="Times New Roman" w:eastAsiaTheme="minorEastAsia" w:hAnsi="Times New Roman" w:cs="Times New Roman"/>
+          <w:rFonts w:ascii="Times New Roman" w:hAnsi="Times New Roman" w:cs="Times New Roman"/>
           <w:b w:val="0"/>
           <w:bCs w:val="0"/>
           <w:color w:val="auto"/>
           <w:sz w:val="21"/>
-          <w:szCs w:val="22"/>
-        </w:rPr>
-        <w:t>AdInsight also includes a review-insight layer that provides additional context about the product being advertised. When a product or company can be identified, the system searches public web sources for relevant information and ranks sources based on their independence from the advertiser. Advertiser-owned pages are excluded, while potential affiliate content is flagged and ranked below independent sources. The persuasion tactic detected by the classifier also helps shape the search strategy; for example, exaggerated or authority-based claims prompt searches focused on evidence, while urgency, scarcity, and FOMO can prompt searches related to subscription, cancellation, or refund experiences.</w:t>
+          <w:szCs w:val="21"/>
+        </w:rPr>
+        <w:t xml:space="preserve"> Overall, </w:t>
       </w:r>
-    </w:p>
-    <w:p>
-      <w:pPr>
-        <w:pStyle w:val="Heading1"/>
-        <w:keepNext w:val="0"/>
-        <w:keepLines w:val="0"/>
-        <w:rPr>
-          <w:rFonts w:ascii="Times New Roman" w:eastAsiaTheme="minorEastAsia" w:hAnsi="Times New Roman" w:cs="Times New Roman"/>
+      <w:proofErr w:type="spellStart"/>
+      <w:r>
+        <w:rPr>
+          <w:rFonts w:ascii="Times New Roman" w:hAnsi="Times New Roman" w:cs="Times New Roman"/>
           <w:b w:val="0"/>
           <w:bCs w:val="0"/>
           <w:color w:val="auto"/>
           <w:sz w:val="21"/>
-          <w:szCs w:val="22"/>
-        </w:rPr>
-      </w:pPr>
+          <w:szCs w:val="21"/>
+        </w:rPr>
+        <w:t>AdInsight</w:t>
+      </w:r>
+      <w:proofErr w:type="spellEnd"/>
       <w:r>
         <w:rPr>
-          <w:rFonts w:ascii="Times New Roman" w:eastAsiaTheme="minorEastAsia" w:hAnsi="Times New Roman" w:cs="Times New Roman"/>
+          <w:rFonts w:ascii="Times New Roman" w:hAnsi="Times New Roman" w:cs="Times New Roman"/>
           <w:b w:val="0"/>
           <w:bCs w:val="0"/>
           <w:color w:val="auto"/>
           <w:sz w:val="21"/>
-          <w:szCs w:val="22"/>
-        </w:rPr>
-        <w:t>The review layer presents this information through plain-language definitions of technical or authoritative-sounding terms, a short summary grounded only in retrieved passages, and links to the underlying sources so users can review the information themselves. If no identifiable product or company is found, the system reports that there is nothing to look up rather than attempting to guess. If the review service is unavailable or cannot retrieve usable results, the interface falls back to clearly labeled sample data rather than interrupting the main ad analysis.</w:t>
-      </w:r>
-    </w:p>
-    <w:p>
-      <w:pPr>
-        <w:pStyle w:val="NormalWeb"/>
-        <w:rPr>
-          <w:sz w:val="21"/>
-          <w:szCs w:val="21"/>
-        </w:rPr>
-      </w:pPr>
-      <w:r>
-        <w:rPr>
-          <w:rFonts w:eastAsiaTheme="minorEastAsia"/>
-          <w:sz w:val="21"/>
-          <w:szCs w:val="21"/>
-        </w:rPr>
-        <w:t>The final interface turns these results into a short explanation instead of showing the user only probabilities or model labels. For image advertisements, the application also displays the text that was extracted before classification. This gives users a way to verify what the system analyzed and helps make possible OCR or transcription errors more transparent</w:t>
-      </w:r>
-      <w:r>
-        <w:rPr>
-          <w:sz w:val="21"/>
-          <w:szCs w:val="21"/>
-        </w:rPr>
-        <w:t xml:space="preserve">. </w:t>
-      </w:r>
-      <w:r>
-        <w:rPr>
-          <w:sz w:val="21"/>
-          <w:szCs w:val="21"/>
-        </w:rPr>
-        <w:t xml:space="preserve">Overall, </w:t>
-      </w:r>
-      <w:proofErr w:type="spellStart"/>
-      <w:r>
-        <w:rPr>
-          <w:sz w:val="21"/>
-          <w:szCs w:val="21"/>
-        </w:rPr>
-        <w:t>AdInsight</w:t>
-      </w:r>
-      <w:proofErr w:type="spellEnd"/>
-      <w:r>
-        <w:rPr>
-          <w:sz w:val="21"/>
           <w:szCs w:val="21"/>
         </w:rPr>
         <w:t xml:space="preserve"> takes text or image-based advertisements, extracts the relevant text when needed, analyzes it with the </w:t>
@@ -642,6 +642,10 @@
       <w:proofErr w:type="spellStart"/>
       <w:r>
         <w:rPr>
+          <w:rFonts w:ascii="Times New Roman" w:hAnsi="Times New Roman" w:cs="Times New Roman"/>
+          <w:b w:val="0"/>
+          <w:bCs w:val="0"/>
+          <w:color w:val="auto"/>
           <w:sz w:val="21"/>
           <w:szCs w:val="21"/>
         </w:rPr>
@@ -650,77 +654,21 @@
       <w:proofErr w:type="spellEnd"/>
       <w:r>
         <w:rPr>
-          <w:sz w:val="21"/>
-          <w:szCs w:val="21"/>
-        </w:rPr>
-        <w:t xml:space="preserve"> classifier and phrase-matching system, and returns a plain-language explanation along with outside context from the review-insight layer.</w:t>
-      </w:r>
-    </w:p>
-    <w:p>
-      <w:pPr>
-        <w:jc w:val="center"/>
-      </w:pPr>
-      <w:r>
-        <w:drawing>
-          <wp:inline xmlns:a="http://schemas.openxmlformats.org/drawingml/2006/main" xmlns:pic="http://schemas.openxmlformats.org/drawingml/2006/picture">
-            <wp:extent cx="4754880" cy="4779906"/>
-            <wp:docPr id="1" name="Picture 1"/>
-            <wp:cNvGraphicFramePr>
-              <a:graphicFrameLocks noChangeAspect="1"/>
-            </wp:cNvGraphicFramePr>
-            <a:graphic>
-              <a:graphicData uri="http://schemas.openxmlformats.org/drawingml/2006/picture">
-                <pic:pic>
-                  <pic:nvPicPr>
-                    <pic:cNvPr id="0" name="workflow_ad_explainer.png"/>
-                    <pic:cNvPicPr/>
-                  </pic:nvPicPr>
-                  <pic:blipFill>
-                    <a:blip r:embed="rId11"/>
-                    <a:stretch>
-                      <a:fillRect/>
-                    </a:stretch>
-                  </pic:blipFill>
-                  <pic:spPr>
-                    <a:xfrm>
-                      <a:off x="0" y="0"/>
-                      <a:ext cx="4754880" cy="4779906"/>
-                    </a:xfrm>
-                    <a:prstGeom prst="rect"/>
-                  </pic:spPr>
-                </pic:pic>
-              </a:graphicData>
-            </a:graphic>
-          </wp:inline>
-        </w:drawing>
-      </w:r>
-    </w:p>
-    <w:p>
-      <w:pPr>
-        <w:jc w:val="center"/>
-      </w:pPr>
-      <w:r>
-        <w:rPr>
-          <w:i/>
-          <w:sz w:val="18"/>
-        </w:rPr>
-        <w:t>Figure 1: AdInsight end-to-end system — ad input (app or browser extension), text extraction, analysis and review insight, and plain-language explanation.</w:t>
-      </w:r>
-    </w:p>
-    <w:p>
-      <w:pPr>
-        <w:pStyle w:val="Heading1"/>
-        <w:keepNext w:val="0"/>
-        <w:keepLines w:val="0"/>
-        <w:rPr>
-          <w:rFonts w:ascii="Times New Roman" w:eastAsiaTheme="minorEastAsia" w:hAnsi="Times New Roman" w:cs="Times New Roman"/>
+          <w:rFonts w:ascii="Times New Roman" w:hAnsi="Times New Roman" w:cs="Times New Roman"/>
           <w:b w:val="0"/>
           <w:bCs w:val="0"/>
           <w:color w:val="auto"/>
           <w:sz w:val="21"/>
-          <w:szCs w:val="22"/>
-        </w:rPr>
-      </w:pPr>
+          <w:szCs w:val="21"/>
+        </w:rPr>
+        <w:t xml:space="preserve"> classifier and phrase-matching system, and returns a plain-language explanation to the</w:t>
+      </w:r>
+      <w:r>
+        <w:rPr>
+          <w:rFonts w:ascii="Times New Roman" w:hAnsi="Times New Roman" w:cs="Times New Roman"/>
+        </w:rPr>
+        <w:t xml:space="preserve"> user.</w:t>
+      </w:r>
     </w:p>
     <w:p>
       <w:pPr>
@@ -1280,7 +1228,47 @@
     </w:p>
     <w:p>
       <w:pPr>
-        <w:pStyle w:val="Heading1"/>
+        <w:pStyle w:val="NormalWeb"/>
+        <w:rPr>
+          <w:color w:val="FFFFFF"/>
+          <w:sz w:val="21"/>
+          <w:szCs w:val="21"/>
+        </w:rPr>
+      </w:pPr>
+      <w:r>
+        <w:rPr>
+          <w:rFonts w:eastAsiaTheme="minorEastAsia"/>
+          <w:sz w:val="21"/>
+          <w:szCs w:val="21"/>
+        </w:rPr>
+        <w:t xml:space="preserve">The project originally used a smaller seven-class dataset. Analysis of that dataset revealed that some classes contained highly repetitive phrases, which created a risk that the model could learn shortcuts rather than broader persuasive patterns. For example, “limited stock” appeared in 435 of 449 Scarcity examples. </w:t>
+      </w:r>
+      <w:r>
+        <w:rPr>
+          <w:sz w:val="21"/>
+          <w:szCs w:val="21"/>
+        </w:rPr>
+        <w:t>To increase the variety of language in the training data, we incorporated approximately 940 examples from the Mathur et al. dark-patterns corpus, which contains real-world e-commerce language collected from shopping</w:t>
+      </w:r>
+      <w:r>
+        <w:rPr>
+          <w:sz w:val="21"/>
+          <w:szCs w:val="21"/>
+        </w:rPr>
+        <w:t xml:space="preserve"> websites. </w:t>
+      </w:r>
+      <w:r>
+        <w:rPr>
+          <w:rFonts w:eastAsiaTheme="minorEastAsia"/>
+          <w:sz w:val="21"/>
+          <w:szCs w:val="21"/>
+        </w:rPr>
+        <w:t>Compatible examples were mapped to our existing Scarcity, Urgency, and Social Proof categories.</w:t>
+      </w:r>
+    </w:p>
+    <w:p>
+      <w:pPr>
+        <w:pStyle w:val="Heading2"/>
         <w:keepNext w:val="0"/>
         <w:keepLines w:val="0"/>
         <w:rPr>
@@ -1301,12 +1289,12 @@
           <w:sz w:val="21"/>
           <w:szCs w:val="22"/>
         </w:rPr>
-        <w:t>The project originally used a smaller seven-class dataset. Analysis of that dataset revealed that some classes contained highly repetitive phrases, which created a risk that the model could learn shortcuts rather than broader persuasive patterns. For example, “limited stock” appeared in 435 of 449 Scarcity examples. To increase the variety of language in the training data, we incorporated 857 examples from the Mathur et al. dark-patterns corpus, which contains real-world e-commerce language collected from shopping websites. Compatible examples were mapped to our existing Scarcity, Urgency, and Social Proof categories.</w:t>
+        <w:t>We also added a Neutral category because the earlier dataset contained only advertisements associated with a persuasion tactic. Without Neutral examples, the classifier was effectively forced to select a persuasion category even when no clear tactic was present. After these changes, the final training corpus contained 4,374 examples across eight classes.</w:t>
       </w:r>
     </w:p>
     <w:p>
       <w:pPr>
-        <w:pStyle w:val="Heading1"/>
+        <w:pStyle w:val="Heading2"/>
         <w:keepNext w:val="0"/>
         <w:keepLines w:val="0"/>
         <w:rPr>
@@ -1327,33 +1315,6 @@
           <w:sz w:val="21"/>
           <w:szCs w:val="22"/>
         </w:rPr>
-        <w:t>We also added a Neutral category because the earlier dataset contained only advertisements associated with a persuasion tactic. Without Neutral examples, the classifier was effectively forced to select a persuasion category even when no clear tactic was present. After these changes, the final training corpus contained 4,374 examples across eight classes.</w:t>
-      </w:r>
-    </w:p>
-    <w:p>
-      <w:pPr>
-        <w:pStyle w:val="Heading1"/>
-        <w:keepNext w:val="0"/>
-        <w:keepLines w:val="0"/>
-        <w:rPr>
-          <w:rFonts w:ascii="Times New Roman" w:eastAsiaTheme="minorEastAsia" w:hAnsi="Times New Roman" w:cs="Times New Roman"/>
-          <w:b w:val="0"/>
-          <w:bCs w:val="0"/>
-          <w:color w:val="auto"/>
-          <w:sz w:val="21"/>
-          <w:szCs w:val="22"/>
-        </w:rPr>
-      </w:pPr>
-      <w:r>
-        <w:rPr>
-          <w:rFonts w:ascii="Times New Roman" w:eastAsiaTheme="minorEastAsia" w:hAnsi="Times New Roman" w:cs="Times New Roman"/>
-          <w:b w:val="0"/>
-          <w:bCs w:val="0"/>
-          <w:color w:val="auto"/>
-          <w:sz w:val="21"/>
-          <w:szCs w:val="22"/>
-        </w:rPr>
-        <w:lastRenderedPageBreak/>
         <w:t>The dataset remained imbalanced, with 959 Urgency examples compared with 222 FOMO examples. To reduce the impact of this imbalance during training, we used class-weighted cross-entropy loss, giving less frequent classes greater weight in the loss calculation.</w:t>
       </w:r>
     </w:p>
@@ -1389,70 +1350,70 @@
         <w:keepNext w:val="0"/>
         <w:keepLines w:val="0"/>
         <w:rPr>
-          <w:rFonts w:ascii="Times New Roman" w:eastAsiaTheme="minorEastAsia" w:hAnsi="Times New Roman" w:cs="Times New Roman"/>
+          <w:rFonts w:ascii="Times New Roman" w:hAnsi="Times New Roman" w:cs="Times New Roman"/>
           <w:b w:val="0"/>
           <w:bCs w:val="0"/>
           <w:color w:val="auto"/>
           <w:sz w:val="21"/>
-          <w:szCs w:val="22"/>
+          <w:szCs w:val="21"/>
         </w:rPr>
       </w:pPr>
       <w:r>
         <w:rPr>
-          <w:rFonts w:ascii="Times New Roman" w:eastAsiaTheme="minorEastAsia" w:hAnsi="Times New Roman" w:cs="Times New Roman"/>
+          <w:rFonts w:ascii="Times New Roman" w:hAnsi="Times New Roman" w:cs="Times New Roman"/>
           <w:b w:val="0"/>
           <w:bCs w:val="0"/>
           <w:color w:val="auto"/>
           <w:sz w:val="21"/>
-          <w:szCs w:val="22"/>
+          <w:szCs w:val="21"/>
         </w:rPr>
         <w:t xml:space="preserve">We selected </w:t>
       </w:r>
       <w:proofErr w:type="spellStart"/>
       <w:r>
         <w:rPr>
-          <w:rFonts w:ascii="Times New Roman" w:eastAsiaTheme="minorEastAsia" w:hAnsi="Times New Roman" w:cs="Times New Roman"/>
+          <w:rFonts w:ascii="Times New Roman" w:hAnsi="Times New Roman" w:cs="Times New Roman"/>
           <w:b w:val="0"/>
           <w:bCs w:val="0"/>
           <w:color w:val="auto"/>
           <w:sz w:val="21"/>
-          <w:szCs w:val="22"/>
+          <w:szCs w:val="21"/>
         </w:rPr>
         <w:t>DistilBERT</w:t>
       </w:r>
       <w:proofErr w:type="spellEnd"/>
       <w:r>
         <w:rPr>
-          <w:rFonts w:ascii="Times New Roman" w:eastAsiaTheme="minorEastAsia" w:hAnsi="Times New Roman" w:cs="Times New Roman"/>
+          <w:rFonts w:ascii="Times New Roman" w:hAnsi="Times New Roman" w:cs="Times New Roman"/>
           <w:b w:val="0"/>
           <w:bCs w:val="0"/>
           <w:color w:val="auto"/>
           <w:sz w:val="21"/>
-          <w:szCs w:val="22"/>
+          <w:szCs w:val="21"/>
         </w:rPr>
         <w:t xml:space="preserve"> as the primary NLP classifier and fine-tuned the pretrained </w:t>
       </w:r>
       <w:proofErr w:type="spellStart"/>
       <w:r>
         <w:rPr>
-          <w:rFonts w:ascii="Times New Roman" w:eastAsiaTheme="minorEastAsia" w:hAnsi="Times New Roman" w:cs="Times New Roman"/>
+          <w:rFonts w:ascii="Times New Roman" w:hAnsi="Times New Roman" w:cs="Times New Roman"/>
           <w:b w:val="0"/>
           <w:bCs w:val="0"/>
           <w:color w:val="auto"/>
           <w:sz w:val="21"/>
-          <w:szCs w:val="22"/>
+          <w:szCs w:val="21"/>
         </w:rPr>
         <w:t>distilbert</w:t>
       </w:r>
       <w:proofErr w:type="spellEnd"/>
       <w:r>
         <w:rPr>
-          <w:rFonts w:ascii="Times New Roman" w:eastAsiaTheme="minorEastAsia" w:hAnsi="Times New Roman" w:cs="Times New Roman"/>
+          <w:rFonts w:ascii="Times New Roman" w:hAnsi="Times New Roman" w:cs="Times New Roman"/>
           <w:b w:val="0"/>
           <w:bCs w:val="0"/>
           <w:color w:val="auto"/>
           <w:sz w:val="21"/>
-          <w:szCs w:val="22"/>
+          <w:szCs w:val="21"/>
         </w:rPr>
         <w:t>-base-uncased model for our persuasion-tactic classification task.</w:t>
       </w:r>
@@ -1463,22 +1424,22 @@
         <w:keepNext w:val="0"/>
         <w:keepLines w:val="0"/>
         <w:rPr>
-          <w:rFonts w:ascii="Times New Roman" w:eastAsiaTheme="minorEastAsia" w:hAnsi="Times New Roman" w:cs="Times New Roman"/>
+          <w:rFonts w:ascii="Times New Roman" w:hAnsi="Times New Roman" w:cs="Times New Roman"/>
           <w:b w:val="0"/>
           <w:bCs w:val="0"/>
           <w:color w:val="auto"/>
           <w:sz w:val="21"/>
-          <w:szCs w:val="22"/>
+          <w:szCs w:val="21"/>
         </w:rPr>
       </w:pPr>
       <w:r>
         <w:rPr>
-          <w:rFonts w:ascii="Times New Roman" w:eastAsiaTheme="minorEastAsia" w:hAnsi="Times New Roman" w:cs="Times New Roman"/>
+          <w:rFonts w:ascii="Times New Roman" w:hAnsi="Times New Roman" w:cs="Times New Roman"/>
           <w:b w:val="0"/>
           <w:bCs w:val="0"/>
           <w:color w:val="auto"/>
           <w:sz w:val="21"/>
-          <w:szCs w:val="22"/>
+          <w:szCs w:val="21"/>
         </w:rPr>
         <w:t>The data was divided using a stratified 70/15/15 train-validation-test split so that each subset maintained approximately the same class distribution. The test set remained held out during model selection and hyperparameter tuning.</w:t>
       </w:r>
@@ -1489,22 +1450,22 @@
         <w:keepNext w:val="0"/>
         <w:keepLines w:val="0"/>
         <w:rPr>
-          <w:rFonts w:ascii="Times New Roman" w:eastAsiaTheme="minorEastAsia" w:hAnsi="Times New Roman" w:cs="Times New Roman"/>
+          <w:rFonts w:ascii="Times New Roman" w:hAnsi="Times New Roman" w:cs="Times New Roman"/>
           <w:b w:val="0"/>
           <w:bCs w:val="0"/>
           <w:color w:val="auto"/>
           <w:sz w:val="21"/>
-          <w:szCs w:val="22"/>
+          <w:szCs w:val="21"/>
         </w:rPr>
       </w:pPr>
       <w:r>
         <w:rPr>
-          <w:rFonts w:ascii="Times New Roman" w:eastAsiaTheme="minorEastAsia" w:hAnsi="Times New Roman" w:cs="Times New Roman"/>
+          <w:rFonts w:ascii="Times New Roman" w:hAnsi="Times New Roman" w:cs="Times New Roman"/>
           <w:b w:val="0"/>
           <w:bCs w:val="0"/>
           <w:color w:val="auto"/>
           <w:sz w:val="21"/>
-          <w:szCs w:val="22"/>
+          <w:szCs w:val="21"/>
         </w:rPr>
         <w:t>Our primary evaluation metric was macro F1. Because the dataset is imbalanced, accuracy alone could hide weaker performance on the less common persuasion categories. Macro F1 calculates the F1 score for each class independently and gives each class equal weight, making it a better measure of performance across all eight categories.</w:t>
       </w:r>
@@ -1515,24 +1476,49 @@
         <w:keepNext w:val="0"/>
         <w:keepLines w:val="0"/>
         <w:rPr>
-          <w:rFonts w:ascii="Times New Roman" w:eastAsiaTheme="minorEastAsia" w:hAnsi="Times New Roman" w:cs="Times New Roman"/>
+          <w:rFonts w:ascii="Times New Roman" w:hAnsi="Times New Roman" w:cs="Times New Roman"/>
           <w:b w:val="0"/>
           <w:bCs w:val="0"/>
           <w:color w:val="auto"/>
           <w:sz w:val="21"/>
-          <w:szCs w:val="22"/>
+          <w:szCs w:val="21"/>
         </w:rPr>
       </w:pPr>
       <w:r>
         <w:rPr>
-          <w:rFonts w:ascii="Times New Roman" w:eastAsiaTheme="minorEastAsia" w:hAnsi="Times New Roman" w:cs="Times New Roman"/>
+          <w:rFonts w:ascii="Times New Roman" w:hAnsi="Times New Roman" w:cs="Times New Roman"/>
           <w:b w:val="0"/>
           <w:bCs w:val="0"/>
           <w:color w:val="auto"/>
           <w:sz w:val="21"/>
-          <w:szCs w:val="22"/>
-        </w:rPr>
-        <w:t>To provide baselines for comparison, we also evaluated two non-neural approaches using the same stratified data split as the DistilBERT model. The first was a majority-class baseline that always predicted Urgency, the most frequent class in the dataset. The second used TF-IDF word unigram and bigram features with class-balanced logistic regression. These baselines provide both a simple lower bound and a stronger traditional NLP comparison for evaluating whether the transformer-based model provides additional value.</w:t>
+          <w:szCs w:val="21"/>
+        </w:rPr>
+        <w:lastRenderedPageBreak/>
+        <w:t xml:space="preserve">To provide baselines for comparison, we also evaluated two non-neural approaches using the same stratified data split as the </w:t>
+      </w:r>
+      <w:proofErr w:type="spellStart"/>
+      <w:r>
+        <w:rPr>
+          <w:rFonts w:ascii="Times New Roman" w:hAnsi="Times New Roman" w:cs="Times New Roman"/>
+          <w:b w:val="0"/>
+          <w:bCs w:val="0"/>
+          <w:color w:val="auto"/>
+          <w:sz w:val="21"/>
+          <w:szCs w:val="21"/>
+        </w:rPr>
+        <w:t>DistilBERT</w:t>
+      </w:r>
+      <w:proofErr w:type="spellEnd"/>
+      <w:r>
+        <w:rPr>
+          <w:rFonts w:ascii="Times New Roman" w:hAnsi="Times New Roman" w:cs="Times New Roman"/>
+          <w:b w:val="0"/>
+          <w:bCs w:val="0"/>
+          <w:color w:val="auto"/>
+          <w:sz w:val="21"/>
+          <w:szCs w:val="21"/>
+        </w:rPr>
+        <w:t xml:space="preserve"> model. The first was a majority-class baseline that always predicted Urgency, the most frequent class in the dataset. The second used TF-IDF word unigram and bigram features with class-balanced logistic regression.</w:t>
       </w:r>
     </w:p>
     <w:p>
@@ -1541,96 +1527,96 @@
         <w:keepNext w:val="0"/>
         <w:keepLines w:val="0"/>
         <w:rPr>
-          <w:rFonts w:ascii="Times New Roman" w:eastAsiaTheme="minorEastAsia" w:hAnsi="Times New Roman" w:cs="Times New Roman"/>
+          <w:rFonts w:ascii="Times New Roman" w:hAnsi="Times New Roman" w:cs="Times New Roman"/>
           <w:b w:val="0"/>
           <w:bCs w:val="0"/>
           <w:color w:val="auto"/>
           <w:sz w:val="21"/>
-          <w:szCs w:val="22"/>
+          <w:szCs w:val="21"/>
         </w:rPr>
       </w:pPr>
       <w:r>
         <w:rPr>
-          <w:rFonts w:ascii="Times New Roman" w:eastAsiaTheme="minorEastAsia" w:hAnsi="Times New Roman" w:cs="Times New Roman"/>
+          <w:rFonts w:ascii="Times New Roman" w:hAnsi="Times New Roman" w:cs="Times New Roman"/>
           <w:b w:val="0"/>
           <w:bCs w:val="0"/>
           <w:color w:val="auto"/>
           <w:sz w:val="21"/>
-          <w:szCs w:val="22"/>
+          <w:szCs w:val="21"/>
         </w:rPr>
         <w:t xml:space="preserve">We first trained a baseline </w:t>
       </w:r>
       <w:proofErr w:type="spellStart"/>
       <w:r>
         <w:rPr>
-          <w:rFonts w:ascii="Times New Roman" w:eastAsiaTheme="minorEastAsia" w:hAnsi="Times New Roman" w:cs="Times New Roman"/>
+          <w:rFonts w:ascii="Times New Roman" w:hAnsi="Times New Roman" w:cs="Times New Roman"/>
           <w:b w:val="0"/>
           <w:bCs w:val="0"/>
           <w:color w:val="auto"/>
           <w:sz w:val="21"/>
-          <w:szCs w:val="22"/>
+          <w:szCs w:val="21"/>
         </w:rPr>
         <w:t>DistilBERT</w:t>
       </w:r>
       <w:proofErr w:type="spellEnd"/>
       <w:r>
         <w:rPr>
-          <w:rFonts w:ascii="Times New Roman" w:eastAsiaTheme="minorEastAsia" w:hAnsi="Times New Roman" w:cs="Times New Roman"/>
+          <w:rFonts w:ascii="Times New Roman" w:hAnsi="Times New Roman" w:cs="Times New Roman"/>
           <w:b w:val="0"/>
           <w:bCs w:val="0"/>
           <w:color w:val="auto"/>
           <w:sz w:val="21"/>
-          <w:szCs w:val="22"/>
+          <w:szCs w:val="21"/>
         </w:rPr>
         <w:t xml:space="preserve"> classifier and then used </w:t>
       </w:r>
       <w:proofErr w:type="spellStart"/>
       <w:r>
         <w:rPr>
-          <w:rFonts w:ascii="Times New Roman" w:eastAsiaTheme="minorEastAsia" w:hAnsi="Times New Roman" w:cs="Times New Roman"/>
+          <w:rFonts w:ascii="Times New Roman" w:hAnsi="Times New Roman" w:cs="Times New Roman"/>
           <w:b w:val="0"/>
           <w:bCs w:val="0"/>
           <w:color w:val="auto"/>
           <w:sz w:val="21"/>
-          <w:szCs w:val="22"/>
+          <w:szCs w:val="21"/>
         </w:rPr>
         <w:t>Hyperopt</w:t>
       </w:r>
       <w:proofErr w:type="spellEnd"/>
       <w:r>
         <w:rPr>
-          <w:rFonts w:ascii="Times New Roman" w:eastAsiaTheme="minorEastAsia" w:hAnsi="Times New Roman" w:cs="Times New Roman"/>
+          <w:rFonts w:ascii="Times New Roman" w:hAnsi="Times New Roman" w:cs="Times New Roman"/>
           <w:b w:val="0"/>
           <w:bCs w:val="0"/>
           <w:color w:val="auto"/>
           <w:sz w:val="21"/>
-          <w:szCs w:val="22"/>
+          <w:szCs w:val="21"/>
         </w:rPr>
         <w:t xml:space="preserve"> with Tree-structured </w:t>
       </w:r>
       <w:proofErr w:type="spellStart"/>
       <w:r>
         <w:rPr>
-          <w:rFonts w:ascii="Times New Roman" w:eastAsiaTheme="minorEastAsia" w:hAnsi="Times New Roman" w:cs="Times New Roman"/>
+          <w:rFonts w:ascii="Times New Roman" w:hAnsi="Times New Roman" w:cs="Times New Roman"/>
           <w:b w:val="0"/>
           <w:bCs w:val="0"/>
           <w:color w:val="auto"/>
           <w:sz w:val="21"/>
-          <w:szCs w:val="22"/>
+          <w:szCs w:val="21"/>
         </w:rPr>
         <w:t>Parzen</w:t>
       </w:r>
       <w:proofErr w:type="spellEnd"/>
       <w:r>
         <w:rPr>
-          <w:rFonts w:ascii="Times New Roman" w:eastAsiaTheme="minorEastAsia" w:hAnsi="Times New Roman" w:cs="Times New Roman"/>
+          <w:rFonts w:ascii="Times New Roman" w:hAnsi="Times New Roman" w:cs="Times New Roman"/>
           <w:b w:val="0"/>
           <w:bCs w:val="0"/>
           <w:color w:val="auto"/>
           <w:sz w:val="21"/>
-          <w:szCs w:val="22"/>
-        </w:rPr>
-        <w:t xml:space="preserve"> Estimator (TPE) search to tune the training configuration. The search included learning rates of 1e-5, 2e-5, 3e-5, and 5e-5; batch sizes of 8 and 16; two, three, or four epochs; and weight-decay values of 0, 0.01, and 0.05. TPE sampled three trial configurations from this space, selected on validation macro F1.</w:t>
+          <w:szCs w:val="21"/>
+        </w:rPr>
+        <w:t xml:space="preserve"> Estimator (TPE) search to tune the training configuration. The search included learning rates of 1e-5, 2e-5, 3e-5, and 5e-5; batch sizes of 8 and 16; two, three, or four epochs; and weight-decay values of 0, 0.01, and 0.05.</w:t>
       </w:r>
     </w:p>
     <w:p>
@@ -1780,21 +1766,26 @@
       <w:tblPr>
         <w:tblStyle w:val="TableGrid"/>
         <w:tblW w:w="0" w:type="auto"/>
+        <w:jc w:val="center"/>
         <w:tblLook w:val="04A0" w:firstRow="1" w:lastRow="0" w:firstColumn="1" w:lastColumn="0" w:noHBand="0" w:noVBand="1"/>
       </w:tblPr>
       <w:tblGrid>
-        <w:gridCol w:w="2539"/>
-        <w:gridCol w:w="2539"/>
-        <w:gridCol w:w="2539"/>
-        <w:gridCol w:w="2539"/>
+        <w:gridCol w:w="2750"/>
+        <w:gridCol w:w="2644"/>
+        <w:gridCol w:w="2381"/>
+        <w:gridCol w:w="2381"/>
       </w:tblGrid>
       <w:tr>
+        <w:trPr>
+          <w:jc w:val="center"/>
+        </w:trPr>
         <w:tc>
           <w:tcPr>
-            <w:tcW w:w="2541" w:type="dxa"/>
+            <w:tcW w:w="2750" w:type="dxa"/>
           </w:tcPr>
           <w:p>
             <w:pPr>
+              <w:spacing w:after="0"/>
               <w:rPr>
                 <w:rFonts w:ascii="Times New Roman" w:hAnsi="Times New Roman" w:cs="Times New Roman"/>
               </w:rPr>
@@ -1802,6 +1793,8 @@
             <w:r>
               <w:rPr>
                 <w:rFonts w:ascii="Times New Roman" w:hAnsi="Times New Roman" w:cs="Times New Roman"/>
+                <w:b/>
+                <w:sz w:val="18"/>
               </w:rPr>
               <w:t>Metric</w:t>
             </w:r>
@@ -1809,10 +1802,11 @@
         </w:tc>
         <w:tc>
           <w:tcPr>
-            <w:tcW w:w="2541" w:type="dxa"/>
+            <w:tcW w:w="2644" w:type="dxa"/>
           </w:tcPr>
           <w:p>
             <w:pPr>
+              <w:spacing w:after="0"/>
               <w:rPr>
                 <w:rFonts w:ascii="Times New Roman" w:hAnsi="Times New Roman" w:cs="Times New Roman"/>
               </w:rPr>
@@ -1820,6 +1814,8 @@
             <w:r>
               <w:rPr>
                 <w:rFonts w:ascii="Times New Roman" w:hAnsi="Times New Roman" w:cs="Times New Roman"/>
+                <w:b/>
+                <w:sz w:val="18"/>
               </w:rPr>
               <w:t>Majority Class</w:t>
             </w:r>
@@ -1827,10 +1823,88 @@
         </w:tc>
         <w:tc>
           <w:tcPr>
-            <w:tcW w:w="2541" w:type="dxa"/>
+            <w:tcW w:w="2381" w:type="dxa"/>
           </w:tcPr>
           <w:p>
             <w:pPr>
+              <w:spacing w:after="0"/>
+              <w:rPr>
+                <w:rFonts w:ascii="Times New Roman" w:hAnsi="Times New Roman" w:cs="Times New Roman"/>
+                <w:b/>
+                <w:sz w:val="18"/>
+              </w:rPr>
+            </w:pPr>
+            <w:r>
+              <w:rPr>
+                <w:rFonts w:ascii="Times New Roman" w:hAnsi="Times New Roman" w:cs="Times New Roman"/>
+                <w:b/>
+                <w:sz w:val="18"/>
+              </w:rPr>
+              <w:t>TF-IDF</w:t>
+            </w:r>
+            <w:r>
+              <w:rPr>
+                <w:rFonts w:ascii="Times New Roman" w:hAnsi="Times New Roman" w:cs="Times New Roman"/>
+                <w:b/>
+                <w:sz w:val="18"/>
+              </w:rPr>
+              <w:t xml:space="preserve"> </w:t>
+            </w:r>
+            <w:r>
+              <w:rPr>
+                <w:rFonts w:ascii="Times New Roman" w:hAnsi="Times New Roman" w:cs="Times New Roman"/>
+                <w:b/>
+                <w:sz w:val="18"/>
+              </w:rPr>
+              <w:t xml:space="preserve">+ Logic Regression </w:t>
+            </w:r>
+          </w:p>
+        </w:tc>
+        <w:tc>
+          <w:tcPr>
+            <w:tcW w:w="2381" w:type="dxa"/>
+          </w:tcPr>
+          <w:p>
+            <w:pPr>
+              <w:spacing w:after="0"/>
+              <w:rPr>
+                <w:rFonts w:ascii="Times New Roman" w:hAnsi="Times New Roman" w:cs="Times New Roman"/>
+                <w:b/>
+                <w:sz w:val="18"/>
+              </w:rPr>
+            </w:pPr>
+            <w:r>
+              <w:rPr>
+                <w:rFonts w:ascii="Times New Roman" w:hAnsi="Times New Roman" w:cs="Times New Roman"/>
+                <w:b/>
+                <w:sz w:val="18"/>
+              </w:rPr>
+              <w:t xml:space="preserve">Final </w:t>
+            </w:r>
+            <w:proofErr w:type="spellStart"/>
+            <w:r>
+              <w:rPr>
+                <w:rFonts w:ascii="Times New Roman" w:hAnsi="Times New Roman" w:cs="Times New Roman"/>
+                <w:b/>
+                <w:sz w:val="18"/>
+              </w:rPr>
+              <w:t>DistilBERT</w:t>
+            </w:r>
+            <w:proofErr w:type="spellEnd"/>
+          </w:p>
+        </w:tc>
+      </w:tr>
+      <w:tr>
+        <w:trPr>
+          <w:jc w:val="center"/>
+        </w:trPr>
+        <w:tc>
+          <w:tcPr>
+            <w:tcW w:w="2750" w:type="dxa"/>
+          </w:tcPr>
+          <w:p>
+            <w:pPr>
+              <w:spacing w:after="0"/>
               <w:rPr>
                 <w:rFonts w:ascii="Times New Roman" w:hAnsi="Times New Roman" w:cs="Times New Roman"/>
               </w:rPr>
@@ -1838,17 +1912,101 @@
             <w:r>
               <w:rPr>
                 <w:rFonts w:ascii="Times New Roman" w:hAnsi="Times New Roman" w:cs="Times New Roman"/>
+                <w:sz w:val="18"/>
               </w:rPr>
-              <w:t>TF-IDF + Logistic Regression</w:t>
+              <w:t>Test Accuracy</w:t>
             </w:r>
           </w:p>
         </w:tc>
         <w:tc>
           <w:tcPr>
-            <w:tcW w:w="2541" w:type="dxa"/>
+            <w:tcW w:w="2644" w:type="dxa"/>
           </w:tcPr>
           <w:p>
             <w:pPr>
+              <w:spacing w:after="0"/>
+              <w:rPr>
+                <w:rFonts w:ascii="Times New Roman" w:hAnsi="Times New Roman" w:cs="Times New Roman"/>
+                <w:sz w:val="18"/>
+                <w:szCs w:val="18"/>
+              </w:rPr>
+            </w:pPr>
+            <w:r>
+              <w:rPr>
+                <w:rFonts w:ascii="Times New Roman" w:hAnsi="Times New Roman" w:cs="Times New Roman"/>
+                <w:sz w:val="18"/>
+                <w:szCs w:val="18"/>
+              </w:rPr>
+              <w:t>0.2192</w:t>
+            </w:r>
+          </w:p>
+        </w:tc>
+        <w:tc>
+          <w:tcPr>
+            <w:tcW w:w="2381" w:type="dxa"/>
+          </w:tcPr>
+          <w:p>
+            <w:pPr>
+              <w:spacing w:after="0"/>
+              <w:rPr>
+                <w:rFonts w:ascii="Times New Roman" w:hAnsi="Times New Roman" w:cs="Times New Roman"/>
+                <w:sz w:val="18"/>
+                <w:szCs w:val="18"/>
+              </w:rPr>
+            </w:pPr>
+            <w:r>
+              <w:rPr>
+                <w:rFonts w:ascii="Times New Roman" w:hAnsi="Times New Roman" w:cs="Times New Roman"/>
+                <w:sz w:val="18"/>
+                <w:szCs w:val="18"/>
+              </w:rPr>
+              <w:t>0.9011</w:t>
+            </w:r>
+          </w:p>
+        </w:tc>
+        <w:tc>
+          <w:tcPr>
+            <w:tcW w:w="2381" w:type="dxa"/>
+          </w:tcPr>
+          <w:p>
+            <w:pPr>
+              <w:spacing w:after="0"/>
+              <w:rPr>
+                <w:rFonts w:ascii="Times New Roman" w:hAnsi="Times New Roman" w:cs="Times New Roman"/>
+                <w:sz w:val="18"/>
+                <w:szCs w:val="18"/>
+              </w:rPr>
+            </w:pPr>
+            <w:r>
+              <w:rPr>
+                <w:rFonts w:ascii="Times New Roman" w:hAnsi="Times New Roman" w:cs="Times New Roman"/>
+                <w:sz w:val="18"/>
+                <w:szCs w:val="18"/>
+              </w:rPr>
+              <w:t>0.928</w:t>
+            </w:r>
+            <w:r>
+              <w:rPr>
+                <w:rFonts w:ascii="Times New Roman" w:hAnsi="Times New Roman" w:cs="Times New Roman"/>
+                <w:sz w:val="18"/>
+                <w:szCs w:val="18"/>
+              </w:rPr>
+              <w:t>5</w:t>
+            </w:r>
+          </w:p>
+        </w:tc>
+      </w:tr>
+      <w:tr>
+        <w:trPr>
+          <w:jc w:val="center"/>
+        </w:trPr>
+        <w:tc>
+          <w:tcPr>
+            <w:tcW w:w="2750" w:type="dxa"/>
+          </w:tcPr>
+          <w:p>
+            <w:pPr>
+              <w:spacing w:after="0"/>
               <w:rPr>
                 <w:rFonts w:ascii="Times New Roman" w:hAnsi="Times New Roman" w:cs="Times New Roman"/>
               </w:rPr>
@@ -1856,100 +2014,7 @@
             <w:r>
               <w:rPr>
                 <w:rFonts w:ascii="Times New Roman" w:hAnsi="Times New Roman" w:cs="Times New Roman"/>
-              </w:rPr>
-              <w:t>Final DistilBERT</w:t>
-            </w:r>
-          </w:p>
-        </w:tc>
-      </w:tr>
-      <w:tr>
-        <w:tc>
-          <w:tcPr>
-            <w:tcW w:w="2541" w:type="dxa"/>
-          </w:tcPr>
-          <w:p>
-            <w:pPr>
-              <w:rPr>
-                <w:rFonts w:ascii="Times New Roman" w:hAnsi="Times New Roman" w:cs="Times New Roman"/>
-              </w:rPr>
-            </w:pPr>
-            <w:r>
-              <w:rPr>
-                <w:rFonts w:ascii="Times New Roman" w:hAnsi="Times New Roman" w:cs="Times New Roman"/>
-              </w:rPr>
-              <w:t>Test Accuracy</w:t>
-            </w:r>
-          </w:p>
-        </w:tc>
-        <w:tc>
-          <w:tcPr>
-            <w:tcW w:w="2541" w:type="dxa"/>
-          </w:tcPr>
-          <w:p>
-            <w:pPr>
-              <w:rPr>
-                <w:rFonts w:ascii="Times New Roman" w:hAnsi="Times New Roman" w:cs="Times New Roman"/>
-              </w:rPr>
-            </w:pPr>
-            <w:r>
-              <w:rPr>
-                <w:rFonts w:ascii="Times New Roman" w:hAnsi="Times New Roman" w:cs="Times New Roman"/>
-              </w:rPr>
-              <w:t>0.2192</w:t>
-            </w:r>
-          </w:p>
-        </w:tc>
-        <w:tc>
-          <w:tcPr>
-            <w:tcW w:w="2541" w:type="dxa"/>
-          </w:tcPr>
-          <w:p>
-            <w:pPr>
-              <w:rPr>
-                <w:rFonts w:ascii="Times New Roman" w:hAnsi="Times New Roman" w:cs="Times New Roman"/>
-              </w:rPr>
-            </w:pPr>
-            <w:r>
-              <w:rPr>
-                <w:rFonts w:ascii="Times New Roman" w:hAnsi="Times New Roman" w:cs="Times New Roman"/>
-              </w:rPr>
-              <w:t>0.9011</w:t>
-            </w:r>
-          </w:p>
-        </w:tc>
-        <w:tc>
-          <w:tcPr>
-            <w:tcW w:w="2541" w:type="dxa"/>
-          </w:tcPr>
-          <w:p>
-            <w:pPr>
-              <w:rPr>
-                <w:rFonts w:ascii="Times New Roman" w:hAnsi="Times New Roman" w:cs="Times New Roman"/>
-              </w:rPr>
-            </w:pPr>
-            <w:r>
-              <w:rPr>
-                <w:rFonts w:ascii="Times New Roman" w:hAnsi="Times New Roman" w:cs="Times New Roman"/>
-              </w:rPr>
-              <w:t>0.9285</w:t>
-            </w:r>
-          </w:p>
-        </w:tc>
-      </w:tr>
-      <w:tr>
-        <w:tc>
-          <w:tcPr>
-            <w:tcW w:w="2541" w:type="dxa"/>
-          </w:tcPr>
-          <w:p>
-            <w:pPr>
-              <w:rPr>
-                <w:rFonts w:ascii="Times New Roman" w:hAnsi="Times New Roman" w:cs="Times New Roman"/>
-              </w:rPr>
-            </w:pPr>
-            <w:r>
-              <w:rPr>
-                <w:rFonts w:ascii="Times New Roman" w:hAnsi="Times New Roman" w:cs="Times New Roman"/>
+                <w:sz w:val="18"/>
               </w:rPr>
               <w:t>Test Macro F1</w:t>
             </w:r>
@@ -1957,17 +2022,22 @@
         </w:tc>
         <w:tc>
           <w:tcPr>
-            <w:tcW w:w="2541" w:type="dxa"/>
+            <w:tcW w:w="2644" w:type="dxa"/>
           </w:tcPr>
           <w:p>
             <w:pPr>
+              <w:spacing w:after="0"/>
               <w:rPr>
                 <w:rFonts w:ascii="Times New Roman" w:hAnsi="Times New Roman" w:cs="Times New Roman"/>
+                <w:sz w:val="18"/>
+                <w:szCs w:val="18"/>
               </w:rPr>
             </w:pPr>
             <w:r>
               <w:rPr>
                 <w:rFonts w:ascii="Times New Roman" w:hAnsi="Times New Roman" w:cs="Times New Roman"/>
+                <w:sz w:val="18"/>
+                <w:szCs w:val="18"/>
               </w:rPr>
               <w:t>0.0449</w:t>
             </w:r>
@@ -1975,17 +2045,22 @@
         </w:tc>
         <w:tc>
           <w:tcPr>
-            <w:tcW w:w="2541" w:type="dxa"/>
+            <w:tcW w:w="2381" w:type="dxa"/>
           </w:tcPr>
           <w:p>
             <w:pPr>
+              <w:spacing w:after="0"/>
               <w:rPr>
                 <w:rFonts w:ascii="Times New Roman" w:hAnsi="Times New Roman" w:cs="Times New Roman"/>
+                <w:sz w:val="18"/>
+                <w:szCs w:val="18"/>
               </w:rPr>
             </w:pPr>
             <w:r>
               <w:rPr>
                 <w:rFonts w:ascii="Times New Roman" w:hAnsi="Times New Roman" w:cs="Times New Roman"/>
+                <w:sz w:val="18"/>
+                <w:szCs w:val="18"/>
               </w:rPr>
               <w:t>0.8946</w:t>
             </w:r>
@@ -1993,17 +2068,22 @@
         </w:tc>
         <w:tc>
           <w:tcPr>
-            <w:tcW w:w="2541" w:type="dxa"/>
+            <w:tcW w:w="2381" w:type="dxa"/>
           </w:tcPr>
           <w:p>
             <w:pPr>
+              <w:spacing w:after="0"/>
               <w:rPr>
                 <w:rFonts w:ascii="Times New Roman" w:hAnsi="Times New Roman" w:cs="Times New Roman"/>
+                <w:sz w:val="18"/>
+                <w:szCs w:val="18"/>
               </w:rPr>
             </w:pPr>
             <w:r>
               <w:rPr>
                 <w:rFonts w:ascii="Times New Roman" w:hAnsi="Times New Roman" w:cs="Times New Roman"/>
+                <w:sz w:val="18"/>
+                <w:szCs w:val="18"/>
               </w:rPr>
               <w:t>0.9191</w:t>
             </w:r>
@@ -2027,6 +2107,41 @@
       </w:pPr>
       <w:r>
         <w:rPr>
+          <w:rFonts w:ascii="Times New Roman" w:hAnsi="Times New Roman" w:cs="Times New Roman"/>
+          <w:b w:val="0"/>
+          <w:bCs w:val="0"/>
+          <w:color w:val="auto"/>
+          <w:sz w:val="21"/>
+          <w:szCs w:val="21"/>
+        </w:rPr>
+        <w:t xml:space="preserve">The majority-class baseline performed poorly, with 0.2192 accuracy and 0.0449 macro F1. The stronger TF-IDF and logistic regression baseline achieved 0.9011 accuracy and 0.8946 macro F1. The final </w:t>
+      </w:r>
+      <w:proofErr w:type="spellStart"/>
+      <w:r>
+        <w:rPr>
+          <w:rFonts w:ascii="Times New Roman" w:hAnsi="Times New Roman" w:cs="Times New Roman"/>
+          <w:b w:val="0"/>
+          <w:bCs w:val="0"/>
+          <w:color w:val="auto"/>
+          <w:sz w:val="21"/>
+          <w:szCs w:val="21"/>
+        </w:rPr>
+        <w:t>DistilBERT</w:t>
+      </w:r>
+      <w:proofErr w:type="spellEnd"/>
+      <w:r>
+        <w:rPr>
+          <w:rFonts w:ascii="Times New Roman" w:hAnsi="Times New Roman" w:cs="Times New Roman"/>
+          <w:b w:val="0"/>
+          <w:bCs w:val="0"/>
+          <w:color w:val="auto"/>
+          <w:sz w:val="21"/>
+          <w:szCs w:val="21"/>
+        </w:rPr>
+        <w:t xml:space="preserve"> model improved these results to 0.9285 accuracy and 0.9191 macro F1.</w:t>
+      </w:r>
+      <w:r>
+        <w:rPr>
           <w:rFonts w:ascii="Times New Roman" w:eastAsiaTheme="minorEastAsia" w:hAnsi="Times New Roman" w:cs="Times New Roman"/>
           <w:b w:val="0"/>
           <w:bCs w:val="0"/>
@@ -2034,7 +2149,7 @@
           <w:sz w:val="21"/>
           <w:szCs w:val="22"/>
         </w:rPr>
-        <w:t>The majority-class baseline performed poorly, with 0.2192 accuracy and 0.0449 macro F1, showing that simply predicting the most common category does not provide useful performance across the eight persuasion classes. The stronger TF-IDF and logistic regression baseline achieved 0.9011 accuracy and 0.8946 macro F1. The final DistilBERT model improved these results to 0.9285 accuracy and 0.9191 macro F1. This comparison shows that traditional lexical features captured much of the signal in the dataset, while the transformer-based model provided an additional improvement in performance across the persuasion categories.</w:t>
+        <w:t xml:space="preserve"> </w:t>
       </w:r>
     </w:p>
     <w:p>
@@ -2060,45 +2175,7 @@
           <w:sz w:val="21"/>
           <w:szCs w:val="22"/>
         </w:rPr>
-        <w:t>The earlier seven-class model achieved a test accuracy of 0.9090 and macro F1 of 0.8960. After expanding the dataset and adding the Neutral class, the final model improved to 0.9285 accuracy and 0.9191 macro F1 across all eight classes. When evaluating only the seven persuasion categories represented in the earlier model, macro F1 was 0.9070. Social Proof also showed improvement, increasing from an F1 of 0.77 to 0.88.</w:t>
-      </w:r>
-    </w:p>
-    <w:p>
-      <w:pPr>
-        <w:pStyle w:val="Heading1"/>
-        <w:keepNext w:val="0"/>
-        <w:keepLines w:val="0"/>
-        <w:rPr>
-          <w:rFonts w:ascii="Times New Roman" w:eastAsiaTheme="minorEastAsia" w:hAnsi="Times New Roman" w:cs="Times New Roman"/>
-          <w:b w:val="0"/>
-          <w:bCs w:val="0"/>
-          <w:color w:val="auto"/>
-          <w:sz w:val="21"/>
-          <w:szCs w:val="22"/>
-        </w:rPr>
-      </w:pPr>
-      <w:r>
-        <w:rPr>
-          <w:rFonts w:ascii="Times New Roman" w:eastAsiaTheme="minorEastAsia" w:hAnsi="Times New Roman" w:cs="Times New Roman"/>
-          <w:b w:val="0"/>
-          <w:bCs w:val="0"/>
-          <w:color w:val="auto"/>
-          <w:sz w:val="21"/>
-          <w:szCs w:val="22"/>
-        </w:rPr>
-        <w:t xml:space="preserve">While these held-out test results were strong, they did not tell the complete story. We later evaluated the full system on six genuine advertisement screenshots collected from X, Instagram, and short-form video. These advertisements were </w:t>
-      </w:r>
-      <w:r>
-        <w:rPr>
-          <w:rFonts w:ascii="Times New Roman" w:eastAsiaTheme="minorEastAsia" w:hAnsi="Times New Roman" w:cs="Times New Roman"/>
-          <w:b w:val="0"/>
-          <w:bCs w:val="0"/>
-          <w:color w:val="auto"/>
-          <w:sz w:val="21"/>
-          <w:szCs w:val="22"/>
-        </w:rPr>
-        <w:lastRenderedPageBreak/>
-        <w:t>separate from the training corpus and gave us a more realistic view of how the system performed on advertising encountered online.</w:t>
+        <w:t>While these held-out test results were strong, they did not tell the complete story. We later evaluated the full system on six genuine advertisement screenshots collected from X, Instagram, and short-form video. These advertisements were separate from the training corpus and gave us a more realistic view of how the system performed on advertising encountered online.</w:t>
       </w:r>
     </w:p>
     <w:p>
@@ -2305,7 +2382,51 @@
           <w:sz w:val="21"/>
           <w:szCs w:val="22"/>
         </w:rPr>
-        <w:t>Our validation used six users between ages 60 and 74. Each user completed four tasks: analyzing a pasted text advertisement, analyzing an advertisement screenshot, identifying the main persuasion tactic shown in the result, and explaining what the result meant in their own words.</w:t>
+        <w:t xml:space="preserve">Our </w:t>
+      </w:r>
+      <w:r>
+        <w:rPr>
+          <w:rFonts w:ascii="Times New Roman" w:eastAsiaTheme="minorEastAsia" w:hAnsi="Times New Roman" w:cs="Times New Roman"/>
+          <w:b w:val="0"/>
+          <w:bCs w:val="0"/>
+          <w:color w:val="auto"/>
+          <w:sz w:val="21"/>
+          <w:szCs w:val="22"/>
+        </w:rPr>
+        <w:t>v</w:t>
+      </w:r>
+      <w:r>
+        <w:rPr>
+          <w:rFonts w:ascii="Times New Roman" w:eastAsiaTheme="minorEastAsia" w:hAnsi="Times New Roman" w:cs="Times New Roman"/>
+          <w:b w:val="0"/>
+          <w:bCs w:val="0"/>
+          <w:color w:val="auto"/>
+          <w:sz w:val="21"/>
+          <w:szCs w:val="22"/>
+        </w:rPr>
+        <w:t>alidation used six user</w:t>
+      </w:r>
+      <w:r>
+        <w:rPr>
+          <w:rFonts w:ascii="Times New Roman" w:eastAsiaTheme="minorEastAsia" w:hAnsi="Times New Roman" w:cs="Times New Roman"/>
+          <w:b w:val="0"/>
+          <w:bCs w:val="0"/>
+          <w:color w:val="auto"/>
+          <w:sz w:val="21"/>
+          <w:szCs w:val="22"/>
+        </w:rPr>
+        <w:t>s</w:t>
+      </w:r>
+      <w:r>
+        <w:rPr>
+          <w:rFonts w:ascii="Times New Roman" w:eastAsiaTheme="minorEastAsia" w:hAnsi="Times New Roman" w:cs="Times New Roman"/>
+          <w:b w:val="0"/>
+          <w:bCs w:val="0"/>
+          <w:color w:val="auto"/>
+          <w:sz w:val="21"/>
+          <w:szCs w:val="22"/>
+        </w:rPr>
+        <w:t xml:space="preserve"> between ages 60 and 74. Each user completed four tasks: analyzing a pasted text advertisement, analyzing an advertisement screenshot, identifying the main persuasion tactic shown in the result, and explaining what the result meant in their own words.</w:t>
       </w:r>
     </w:p>
     <w:p>
@@ -2381,6 +2502,7 @@
           <w:sz w:val="21"/>
           <w:szCs w:val="22"/>
         </w:rPr>
+        <w:lastRenderedPageBreak/>
         <w:t xml:space="preserve">Users also responded positively to the plain-language explanations provided by </w:t>
       </w:r>
       <w:proofErr w:type="spellStart"/>
@@ -2602,19 +2724,6 @@
     </w:p>
     <w:p>
       <w:pPr>
-        <w:rPr>
-          <w:rFonts w:ascii="Times New Roman" w:hAnsi="Times New Roman" w:cs="Times New Roman"/>
-        </w:rPr>
-      </w:pPr>
-      <w:r>
-        <w:rPr>
-          <w:rFonts w:ascii="Times New Roman" w:hAnsi="Times New Roman" w:cs="Times New Roman"/>
-        </w:rPr>
-        <w:t>Future user testing could also examine how users interact with the review-insight layer, including whether the outside-source summaries, source links, and plain-language definitions provide useful context alongside the persuasion analysis.</w:t>
-      </w:r>
-    </w:p>
-    <w:p>
-      <w:pPr>
         <w:pStyle w:val="Heading1"/>
         <w:keepNext w:val="0"/>
         <w:keepLines w:val="0"/>
@@ -2624,19 +2733,43 @@
           <w:bCs w:val="0"/>
           <w:color w:val="auto"/>
           <w:sz w:val="21"/>
-          <w:szCs w:val="21"/>
+          <w:szCs w:val="22"/>
         </w:rPr>
       </w:pPr>
       <w:r>
         <w:rPr>
-          <w:rFonts w:ascii="Times New Roman" w:hAnsi="Times New Roman" w:cs="Times New Roman"/>
+          <w:rFonts w:ascii="Times New Roman" w:eastAsiaTheme="minorEastAsia" w:hAnsi="Times New Roman" w:cs="Times New Roman"/>
           <w:b w:val="0"/>
           <w:bCs w:val="0"/>
           <w:color w:val="auto"/>
           <w:sz w:val="21"/>
-          <w:szCs w:val="21"/>
-        </w:rPr>
-        <w:t>In future versions, we would continue improving the clarity of the interface by simplifying model-related terminology, making low-confidence results easier to interpret, and keeping the extracted advertisement text visible so users can clearly see what AdInsight analyzed. Additional testing with a larger and more diverse group of older adults would also help determine whether these findings remain consistent across different levels of digital experience.</w:t>
+          <w:szCs w:val="22"/>
+        </w:rPr>
+        <w:t xml:space="preserve">In future versions, we would continue improving the clarity of the interface by simplifying model-related terminology, making low-confidence results easier to interpret, and keeping the extracted advertisement text visible so users can clearly see what </w:t>
+      </w:r>
+      <w:proofErr w:type="spellStart"/>
+      <w:r>
+        <w:rPr>
+          <w:rFonts w:ascii="Times New Roman" w:eastAsiaTheme="minorEastAsia" w:hAnsi="Times New Roman" w:cs="Times New Roman"/>
+          <w:b w:val="0"/>
+          <w:bCs w:val="0"/>
+          <w:color w:val="auto"/>
+          <w:sz w:val="21"/>
+          <w:szCs w:val="22"/>
+        </w:rPr>
+        <w:t>AdInsight</w:t>
+      </w:r>
+      <w:proofErr w:type="spellEnd"/>
+      <w:r>
+        <w:rPr>
+          <w:rFonts w:ascii="Times New Roman" w:eastAsiaTheme="minorEastAsia" w:hAnsi="Times New Roman" w:cs="Times New Roman"/>
+          <w:b w:val="0"/>
+          <w:bCs w:val="0"/>
+          <w:color w:val="auto"/>
+          <w:sz w:val="21"/>
+          <w:szCs w:val="22"/>
+        </w:rPr>
+        <w:t xml:space="preserve"> analyzed. Additional testing with a larger and more diverse group of older adults would also help determine whether these findings remain consistent across different levels of digital experience.</w:t>
       </w:r>
     </w:p>
     <w:p>
@@ -2689,7 +2822,6 @@
           <w:sz w:val="21"/>
           <w:szCs w:val="22"/>
         </w:rPr>
-        <w:lastRenderedPageBreak/>
         <w:t>AdInsight</w:t>
       </w:r>
       <w:proofErr w:type="spellEnd"/>
@@ -2805,32 +2937,6 @@
           <w:szCs w:val="22"/>
         </w:rPr>
         <w:t>Privacy is also an important consideration because users may upload screenshots containing information beyond the advertisement itself. Future versions should minimize unnecessary data processing and clearly communicate what information is analyzed, whether image data is sent to an external service, and whether submitted content is retained.</w:t>
-      </w:r>
-    </w:p>
-    <w:p>
-      <w:pPr>
-        <w:pStyle w:val="Heading1"/>
-        <w:keepNext w:val="0"/>
-        <w:keepLines w:val="0"/>
-        <w:rPr>
-          <w:rFonts w:ascii="Times New Roman" w:eastAsiaTheme="minorEastAsia" w:hAnsi="Times New Roman" w:cs="Times New Roman"/>
-          <w:b w:val="0"/>
-          <w:bCs w:val="0"/>
-          <w:color w:val="auto"/>
-          <w:sz w:val="21"/>
-          <w:szCs w:val="22"/>
-        </w:rPr>
-      </w:pPr>
-      <w:r>
-        <w:rPr>
-          <w:rFonts w:ascii="Times New Roman" w:eastAsiaTheme="minorEastAsia" w:hAnsi="Times New Roman" w:cs="Times New Roman"/>
-          <w:b w:val="0"/>
-          <w:bCs w:val="0"/>
-          <w:color w:val="auto"/>
-          <w:sz w:val="21"/>
-          <w:szCs w:val="22"/>
-        </w:rPr>
-        <w:t>The review-insight layer introduces additional external dependencies because web retrieval and language-model processing rely on outside services. The retrieved information should be treated as context rather than verification, since public web sources may contain opinions, incomplete information, or inaccurate claims. To reduce this risk, AdInsight excludes advertiser-owned pages, flags potential affiliate content, prioritizes more independent sources, and restricts its generated summary to information contained in the retrieved passages.</w:t>
       </w:r>
     </w:p>
     <w:p>

</xml_diff>